<commit_message>
word template header footer added
</commit_message>
<xml_diff>
--- a/Word-Templates/YYYY-BD-nnnn-Liefergegenstand.docx
+++ b/Word-Templates/YYYY-BD-nnnn-Liefergegenstand.docx
@@ -2,7 +2,7 @@
 <file path=word/document.xml><?xml version="1.0" encoding="utf-8"?>
 <w:document xmlns:w="http://schemas.openxmlformats.org/wordprocessingml/2006/main" xmlns:m="http://schemas.openxmlformats.org/officeDocument/2006/math" xmlns:r="http://schemas.openxmlformats.org/officeDocument/2006/relationships" xmlns:o="urn:schemas-microsoft-com:office:office" xmlns:v="urn:schemas-microsoft-com:vml" xmlns:w10="urn:schemas-microsoft-com:office:word" xmlns:a="http://schemas.openxmlformats.org/drawingml/2006/main" xmlns:pic="http://schemas.openxmlformats.org/drawingml/2006/picture" xmlns:wp="http://schemas.openxmlformats.org/drawingml/2006/wordprocessingDrawing">
   <w:body>
-    <w:bookmarkStart w:id="46" w:name="Xa111af535042b559a3ce7f471cbbadc0a02007a"/>
+    <w:bookmarkStart w:id="54" w:name="Xa111af535042b559a3ce7f471cbbadc0a02007a"/>
     <w:p>
       <w:pPr>
         <w:pStyle w:val="berschrift1"/>
@@ -20,7 +20,477 @@
         <w:t xml:space="preserve">Benutzerdokumentation – YYYY-BD-nnnn-Liefergegenstand</w:t>
       </w:r>
     </w:p>
-    <w:bookmarkStart w:id="13" w:name="dokumentinformationen"/>
+    <w:tbl>
+      <w:tblPr>
+        <w:tblStyle w:val="Table"/>
+        <w:tblW w:type="auto" w:w="0"/>
+        <w:tblLook w:firstRow="0" w:lastRow="0" w:firstColumn="0" w:lastColumn="0" w:noHBand="0" w:noVBand="0" w:val="0000"/>
+        <w:tblBorders>
+          <w:top w:val="single" w:sz="4" w:color="BFBFBF"/>
+          <w:left w:val="single" w:sz="4" w:color="BFBFBF"/>
+          <w:bottom w:val="single" w:sz="4" w:color="BFBFBF"/>
+          <w:right w:val="single" w:sz="4" w:color="BFBFBF"/>
+          <w:insideH w:val="single" w:sz="4" w:color="BFBFBF"/>
+          <w:insideV w:val="single" w:sz="4" w:color="BFBFBF"/>
+        </w:tblBorders>
+      </w:tblPr>
+      <w:tblGrid>
+        <w:gridCol w:w="3960"/>
+        <w:gridCol w:w="3960"/>
+      </w:tblGrid>
+      <w:tr>
+        <w:trPr>
+          <w:trHeight w:hRule="exact" w:val="400"/>
+        </w:trPr>
+        <w:tc>
+          <w:tcPr>
+            <w:vAlign w:val="center"/>
+            <w:tcMar>
+              <w:top w:w="0" w:type="dxa"/>
+              <w:bottom w:w="0" w:type="dxa"/>
+              <w:left w:w="80" w:type="dxa"/>
+              <w:right w:w="80" w:type="dxa"/>
+            </w:tcMar>
+          </w:tcPr>
+          <w:p>
+            <w:pPr>
+              <w:pStyle w:val="Compact"/>
+              <w:spacing w:before="0" w:after="0" w:line="240" w:lineRule="auto"/>
+            </w:pPr>
+            <w:r>
+              <w:t xml:space="preserve">Titel</w:t>
+            </w:r>
+          </w:p>
+        </w:tc>
+        <w:tc>
+          <w:tcPr>
+            <w:vAlign w:val="center"/>
+            <w:tcMar>
+              <w:top w:w="0" w:type="dxa"/>
+              <w:bottom w:w="0" w:type="dxa"/>
+              <w:left w:w="80" w:type="dxa"/>
+              <w:right w:w="80" w:type="dxa"/>
+            </w:tcMar>
+          </w:tcPr>
+          <w:p>
+            <w:pPr>
+              <w:pStyle w:val="Compact"/>
+              <w:spacing w:before="0" w:after="0" w:line="240" w:lineRule="auto"/>
+            </w:pPr>
+          </w:p>
+        </w:tc>
+      </w:tr>
+      <w:tr>
+        <w:trPr>
+          <w:trHeight w:hRule="exact" w:val="400"/>
+        </w:trPr>
+        <w:tc>
+          <w:tcPr>
+            <w:vAlign w:val="center"/>
+            <w:tcMar>
+              <w:top w:w="0" w:type="dxa"/>
+              <w:bottom w:w="0" w:type="dxa"/>
+              <w:left w:w="80" w:type="dxa"/>
+              <w:right w:w="80" w:type="dxa"/>
+            </w:tcMar>
+          </w:tcPr>
+          <w:p>
+            <w:pPr>
+              <w:pStyle w:val="Compact"/>
+              <w:spacing w:before="0" w:after="0" w:line="240" w:lineRule="auto"/>
+            </w:pPr>
+            <w:r>
+              <w:t xml:space="preserve">Dokument-Typ</w:t>
+            </w:r>
+          </w:p>
+        </w:tc>
+        <w:tc>
+          <w:tcPr>
+            <w:vAlign w:val="center"/>
+            <w:tcMar>
+              <w:top w:w="0" w:type="dxa"/>
+              <w:bottom w:w="0" w:type="dxa"/>
+              <w:left w:w="80" w:type="dxa"/>
+              <w:right w:w="80" w:type="dxa"/>
+            </w:tcMar>
+          </w:tcPr>
+          <w:p>
+            <w:pPr>
+              <w:pStyle w:val="Compact"/>
+              <w:spacing w:before="0" w:after="0" w:line="240" w:lineRule="auto"/>
+            </w:pPr>
+            <w:r>
+              <w:t xml:space="preserve">Lastenheft</w:t>
+            </w:r>
+          </w:p>
+        </w:tc>
+      </w:tr>
+      <w:tr>
+        <w:trPr>
+          <w:trHeight w:hRule="exact" w:val="400"/>
+        </w:trPr>
+        <w:tc>
+          <w:tcPr>
+            <w:vAlign w:val="center"/>
+            <w:tcMar>
+              <w:top w:w="0" w:type="dxa"/>
+              <w:bottom w:w="0" w:type="dxa"/>
+              <w:left w:w="80" w:type="dxa"/>
+              <w:right w:w="80" w:type="dxa"/>
+            </w:tcMar>
+          </w:tcPr>
+          <w:p>
+            <w:pPr>
+              <w:pStyle w:val="Compact"/>
+              <w:spacing w:before="0" w:after="0" w:line="240" w:lineRule="auto"/>
+            </w:pPr>
+            <w:r>
+              <w:t xml:space="preserve">Liefergegenstand-ID</w:t>
+            </w:r>
+          </w:p>
+        </w:tc>
+        <w:tc>
+          <w:tcPr>
+            <w:vAlign w:val="center"/>
+            <w:tcMar>
+              <w:top w:w="0" w:type="dxa"/>
+              <w:bottom w:w="0" w:type="dxa"/>
+              <w:left w:w="80" w:type="dxa"/>
+              <w:right w:w="80" w:type="dxa"/>
+            </w:tcMar>
+          </w:tcPr>
+          <w:p>
+            <w:pPr>
+              <w:pStyle w:val="Compact"/>
+              <w:spacing w:before="0" w:after="0" w:line="240" w:lineRule="auto"/>
+            </w:pPr>
+          </w:p>
+        </w:tc>
+      </w:tr>
+      <w:tr>
+        <w:trPr>
+          <w:trHeight w:hRule="exact" w:val="400"/>
+        </w:trPr>
+        <w:tc>
+          <w:tcPr>
+            <w:vAlign w:val="center"/>
+            <w:tcMar>
+              <w:top w:w="0" w:type="dxa"/>
+              <w:bottom w:w="0" w:type="dxa"/>
+              <w:left w:w="80" w:type="dxa"/>
+              <w:right w:w="80" w:type="dxa"/>
+            </w:tcMar>
+          </w:tcPr>
+          <w:p>
+            <w:pPr>
+              <w:pStyle w:val="Compact"/>
+              <w:spacing w:before="0" w:after="0" w:line="240" w:lineRule="auto"/>
+            </w:pPr>
+            <w:r>
+              <w:t xml:space="preserve">Liefergegenstand</w:t>
+            </w:r>
+          </w:p>
+        </w:tc>
+        <w:tc>
+          <w:tcPr>
+            <w:vAlign w:val="center"/>
+            <w:tcMar>
+              <w:top w:w="0" w:type="dxa"/>
+              <w:bottom w:w="0" w:type="dxa"/>
+              <w:left w:w="80" w:type="dxa"/>
+              <w:right w:w="80" w:type="dxa"/>
+            </w:tcMar>
+          </w:tcPr>
+          <w:p>
+            <w:pPr>
+              <w:pStyle w:val="Compact"/>
+              <w:spacing w:before="0" w:after="0" w:line="240" w:lineRule="auto"/>
+            </w:pPr>
+          </w:p>
+        </w:tc>
+      </w:tr>
+      <w:tr>
+        <w:trPr>
+          <w:trHeight w:hRule="exact" w:val="400"/>
+        </w:trPr>
+        <w:tc>
+          <w:tcPr>
+            <w:vAlign w:val="center"/>
+            <w:tcMar>
+              <w:top w:w="0" w:type="dxa"/>
+              <w:bottom w:w="0" w:type="dxa"/>
+              <w:left w:w="80" w:type="dxa"/>
+              <w:right w:w="80" w:type="dxa"/>
+            </w:tcMar>
+          </w:tcPr>
+          <w:p>
+            <w:pPr>
+              <w:pStyle w:val="Compact"/>
+              <w:spacing w:before="0" w:after="0" w:line="240" w:lineRule="auto"/>
+            </w:pPr>
+            <w:r>
+              <w:t xml:space="preserve">Bereich</w:t>
+            </w:r>
+          </w:p>
+        </w:tc>
+        <w:tc>
+          <w:tcPr>
+            <w:vAlign w:val="center"/>
+            <w:tcMar>
+              <w:top w:w="0" w:type="dxa"/>
+              <w:bottom w:w="0" w:type="dxa"/>
+              <w:left w:w="80" w:type="dxa"/>
+              <w:right w:w="80" w:type="dxa"/>
+            </w:tcMar>
+          </w:tcPr>
+          <w:p>
+            <w:pPr>
+              <w:pStyle w:val="Compact"/>
+              <w:spacing w:before="0" w:after="0" w:line="240" w:lineRule="auto"/>
+            </w:pPr>
+          </w:p>
+        </w:tc>
+      </w:tr>
+      <w:tr>
+        <w:trPr>
+          <w:trHeight w:hRule="exact" w:val="400"/>
+        </w:trPr>
+        <w:tc>
+          <w:tcPr>
+            <w:vAlign w:val="center"/>
+            <w:tcMar>
+              <w:top w:w="0" w:type="dxa"/>
+              <w:bottom w:w="0" w:type="dxa"/>
+              <w:left w:w="80" w:type="dxa"/>
+              <w:right w:w="80" w:type="dxa"/>
+            </w:tcMar>
+          </w:tcPr>
+          <w:p>
+            <w:pPr>
+              <w:pStyle w:val="Compact"/>
+              <w:spacing w:before="0" w:after="0" w:line="240" w:lineRule="auto"/>
+            </w:pPr>
+            <w:r>
+              <w:t xml:space="preserve">Autor</w:t>
+            </w:r>
+          </w:p>
+        </w:tc>
+        <w:tc>
+          <w:tcPr>
+            <w:vAlign w:val="center"/>
+            <w:tcMar>
+              <w:top w:w="0" w:type="dxa"/>
+              <w:bottom w:w="0" w:type="dxa"/>
+              <w:left w:w="80" w:type="dxa"/>
+              <w:right w:w="80" w:type="dxa"/>
+            </w:tcMar>
+          </w:tcPr>
+          <w:p>
+            <w:pPr>
+              <w:pStyle w:val="Compact"/>
+              <w:spacing w:before="0" w:after="0" w:line="240" w:lineRule="auto"/>
+            </w:pPr>
+          </w:p>
+        </w:tc>
+      </w:tr>
+      <w:tr>
+        <w:trPr>
+          <w:trHeight w:hRule="exact" w:val="400"/>
+        </w:trPr>
+        <w:tc>
+          <w:tcPr>
+            <w:vAlign w:val="center"/>
+            <w:tcMar>
+              <w:top w:w="0" w:type="dxa"/>
+              <w:bottom w:w="0" w:type="dxa"/>
+              <w:left w:w="80" w:type="dxa"/>
+              <w:right w:w="80" w:type="dxa"/>
+            </w:tcMar>
+          </w:tcPr>
+          <w:p>
+            <w:pPr>
+              <w:pStyle w:val="Compact"/>
+              <w:spacing w:before="0" w:after="0" w:line="240" w:lineRule="auto"/>
+            </w:pPr>
+            <w:r>
+              <w:t xml:space="preserve">Version</w:t>
+            </w:r>
+          </w:p>
+        </w:tc>
+        <w:tc>
+          <w:tcPr>
+            <w:vAlign w:val="center"/>
+            <w:tcMar>
+              <w:top w:w="0" w:type="dxa"/>
+              <w:bottom w:w="0" w:type="dxa"/>
+              <w:left w:w="80" w:type="dxa"/>
+              <w:right w:w="80" w:type="dxa"/>
+            </w:tcMar>
+          </w:tcPr>
+          <w:p>
+            <w:pPr>
+              <w:pStyle w:val="Compact"/>
+              <w:spacing w:before="0" w:after="0" w:line="240" w:lineRule="auto"/>
+            </w:pPr>
+          </w:p>
+        </w:tc>
+      </w:tr>
+      <w:tr>
+        <w:trPr>
+          <w:trHeight w:hRule="exact" w:val="400"/>
+        </w:trPr>
+        <w:tc>
+          <w:tcPr>
+            <w:vAlign w:val="center"/>
+            <w:tcMar>
+              <w:top w:w="0" w:type="dxa"/>
+              <w:bottom w:w="0" w:type="dxa"/>
+              <w:left w:w="80" w:type="dxa"/>
+              <w:right w:w="80" w:type="dxa"/>
+            </w:tcMar>
+          </w:tcPr>
+          <w:p>
+            <w:pPr>
+              <w:pStyle w:val="Compact"/>
+              <w:spacing w:before="0" w:after="0" w:line="240" w:lineRule="auto"/>
+            </w:pPr>
+            <w:r>
+              <w:t xml:space="preserve">Status</w:t>
+            </w:r>
+          </w:p>
+        </w:tc>
+        <w:tc>
+          <w:tcPr>
+            <w:vAlign w:val="center"/>
+            <w:tcMar>
+              <w:top w:w="0" w:type="dxa"/>
+              <w:bottom w:w="0" w:type="dxa"/>
+              <w:left w:w="80" w:type="dxa"/>
+              <w:right w:w="80" w:type="dxa"/>
+            </w:tcMar>
+          </w:tcPr>
+          <w:p>
+            <w:pPr>
+              <w:pStyle w:val="Compact"/>
+              <w:spacing w:before="0" w:after="0" w:line="240" w:lineRule="auto"/>
+            </w:pPr>
+            <w:r>
+              <w:t xml:space="preserve">Entwurf / Freigegeben</w:t>
+            </w:r>
+          </w:p>
+        </w:tc>
+      </w:tr>
+      <w:tr>
+        <w:trPr>
+          <w:trHeight w:hRule="exact" w:val="400"/>
+        </w:trPr>
+        <w:tc>
+          <w:tcPr>
+            <w:vAlign w:val="center"/>
+            <w:tcMar>
+              <w:top w:w="0" w:type="dxa"/>
+              <w:bottom w:w="0" w:type="dxa"/>
+              <w:left w:w="80" w:type="dxa"/>
+              <w:right w:w="80" w:type="dxa"/>
+            </w:tcMar>
+          </w:tcPr>
+          <w:p>
+            <w:pPr>
+              <w:pStyle w:val="Compact"/>
+              <w:spacing w:before="0" w:after="0" w:line="240" w:lineRule="auto"/>
+            </w:pPr>
+            <w:r>
+              <w:t xml:space="preserve">Freigeber</w:t>
+            </w:r>
+          </w:p>
+        </w:tc>
+        <w:tc>
+          <w:tcPr>
+            <w:vAlign w:val="center"/>
+            <w:tcMar>
+              <w:top w:w="0" w:type="dxa"/>
+              <w:bottom w:w="0" w:type="dxa"/>
+              <w:left w:w="80" w:type="dxa"/>
+              <w:right w:w="80" w:type="dxa"/>
+            </w:tcMar>
+          </w:tcPr>
+          <w:p>
+            <w:pPr>
+              <w:pStyle w:val="Compact"/>
+              <w:spacing w:before="0" w:after="0" w:line="240" w:lineRule="auto"/>
+            </w:pPr>
+          </w:p>
+        </w:tc>
+      </w:tr>
+      <w:tr>
+        <w:trPr>
+          <w:trHeight w:hRule="exact" w:val="400"/>
+        </w:trPr>
+        <w:tc>
+          <w:tcPr>
+            <w:vAlign w:val="center"/>
+            <w:tcMar>
+              <w:top w:w="0" w:type="dxa"/>
+              <w:bottom w:w="0" w:type="dxa"/>
+              <w:left w:w="80" w:type="dxa"/>
+              <w:right w:w="80" w:type="dxa"/>
+            </w:tcMar>
+          </w:tcPr>
+          <w:p>
+            <w:pPr>
+              <w:pStyle w:val="Compact"/>
+              <w:spacing w:before="0" w:after="0" w:line="240" w:lineRule="auto"/>
+            </w:pPr>
+            <w:r>
+              <w:t xml:space="preserve">Freigabedatum</w:t>
+            </w:r>
+          </w:p>
+        </w:tc>
+        <w:tc>
+          <w:tcPr>
+            <w:vAlign w:val="center"/>
+            <w:tcMar>
+              <w:top w:w="0" w:type="dxa"/>
+              <w:bottom w:w="0" w:type="dxa"/>
+              <w:left w:w="80" w:type="dxa"/>
+              <w:right w:w="80" w:type="dxa"/>
+            </w:tcMar>
+          </w:tcPr>
+          <w:p>
+            <w:pPr>
+              <w:pStyle w:val="Compact"/>
+              <w:spacing w:before="0" w:after="0" w:line="240" w:lineRule="auto"/>
+            </w:pPr>
+          </w:p>
+        </w:tc>
+      </w:tr>
+    </w:tbl>
+    <w:p>
+      <w:pPr>
+        <w:pStyle w:val="berschrift1"/>
+      </w:pPr>
+      <w:r>
+        <w:t>Inhaltsverzeichnis</w:t>
+      </w:r>
+    </w:p>
+    <w:p>
+      <w:r>
+        <w:fldChar w:fldCharType="begin"/>
+      </w:r>
+      <w:r>
+        <w:instrText xml:space="preserve">TOC \\o "1-3" \\h \\z \\u</w:instrText>
+      </w:r>
+      <w:r>
+        <w:fldChar w:fldCharType="separate"/>
+      </w:r>
+      <w:r>
+        <w:t>(Right-click and choose 'Update Field' to build the table of contents.)</w:t>
+      </w:r>
+      <w:r>
+        <w:fldChar w:fldCharType="end"/>
+      </w:r>
+    </w:p>
+    <w:bookmarkStart w:id="21" w:name="dokumentinformationen"/>
     <w:p>
       <w:pPr>
         <w:pStyle w:val="berschrift2"/>
@@ -35,10 +505,10 @@
         <w:tab/>
       </w:r>
       <w:r>
-        <w:t xml:space="preserve">1. Dokumentinformationen</w:t>
-      </w:r>
-    </w:p>
-    <w:bookmarkStart w:id="9" w:name="X86685e6cd1aba8b2facd6bc942c252f2efbf250"/>
+        <w:t xml:space="preserve">Dokumentinformationen</w:t>
+      </w:r>
+    </w:p>
+    <w:bookmarkStart w:id="17" w:name="X86685e6cd1aba8b2facd6bc942c252f2efbf250"/>
     <w:p>
       <w:pPr>
         <w:pStyle w:val="berschrift3"/>
@@ -53,11 +523,11 @@
         <w:tab/>
       </w:r>
       <w:r>
-        <w:t xml:space="preserve">1.1 Prozess-ID und Dateiname: YYYY-BD-nnnn-Liefergegenstand.docx</w:t>
-      </w:r>
-    </w:p>
-    <w:bookmarkEnd w:id="9"/>
-    <w:bookmarkStart w:id="10" w:name="version-und-gültigkeit"/>
+        <w:t xml:space="preserve">Prozess-ID und Dateiname: YYYY-BD-nnnn-Liefergegenstand.docx</w:t>
+      </w:r>
+    </w:p>
+    <w:bookmarkEnd w:id="17"/>
+    <w:bookmarkStart w:id="18" w:name="version-und-gültigkeit"/>
     <w:p>
       <w:pPr>
         <w:pStyle w:val="berschrift3"/>
@@ -72,11 +542,11 @@
         <w:tab/>
       </w:r>
       <w:r>
-        <w:t xml:space="preserve">1.2 Version und Gültigkeit</w:t>
-      </w:r>
-    </w:p>
-    <w:bookmarkEnd w:id="10"/>
-    <w:bookmarkStart w:id="11" w:name="zielgruppe"/>
+        <w:t xml:space="preserve">Version und Gültigkeit</w:t>
+      </w:r>
+    </w:p>
+    <w:bookmarkEnd w:id="18"/>
+    <w:bookmarkStart w:id="19" w:name="zielgruppe"/>
     <w:p>
       <w:pPr>
         <w:pStyle w:val="berschrift3"/>
@@ -91,11 +561,11 @@
         <w:tab/>
       </w:r>
       <w:r>
-        <w:t xml:space="preserve">1.3 Zielgruppe</w:t>
-      </w:r>
-    </w:p>
-    <w:bookmarkEnd w:id="11"/>
-    <w:bookmarkStart w:id="12" w:name="änderungsverlauf"/>
+        <w:t xml:space="preserve">Zielgruppe</w:t>
+      </w:r>
+    </w:p>
+    <w:bookmarkEnd w:id="19"/>
+    <w:bookmarkStart w:id="20" w:name="änderungsverlauf"/>
     <w:p>
       <w:pPr>
         <w:pStyle w:val="berschrift3"/>
@@ -110,164 +580,12 @@
         <w:tab/>
       </w:r>
       <w:r>
-        <w:t xml:space="preserve">1.4 Änderungsverlauf</w:t>
-      </w:r>
-    </w:p>
-    <w:bookmarkEnd w:id="12"/>
-    <w:bookmarkEnd w:id="13"/>
-    <w:bookmarkStart w:id="17" w:name="prozessüberblick"/>
-    <w:p>
-      <w:pPr>
-        <w:pStyle w:val="berschrift2"/>
-      </w:pPr>
-      <w:r>
-        <w:rPr>
-          <w:rStyle w:val="SectionNumber"/>
-        </w:rPr>
-        <w:t xml:space="preserve">1.2</w:t>
-      </w:r>
-      <w:r>
-        <w:tab/>
-      </w:r>
-      <w:r>
-        <w:t xml:space="preserve">2. Prozessüberblick</w:t>
-      </w:r>
-    </w:p>
-    <w:bookmarkStart w:id="14" w:name="zweck-des-prozesses"/>
-    <w:p>
-      <w:pPr>
-        <w:pStyle w:val="berschrift3"/>
-      </w:pPr>
-      <w:r>
-        <w:rPr>
-          <w:rStyle w:val="SectionNumber"/>
-        </w:rPr>
-        <w:t xml:space="preserve">1.2.1</w:t>
-      </w:r>
-      <w:r>
-        <w:tab/>
-      </w:r>
-      <w:r>
-        <w:t xml:space="preserve">2.1 Zweck des Prozesses</w:t>
-      </w:r>
-    </w:p>
-    <w:bookmarkEnd w:id="14"/>
-    <w:bookmarkStart w:id="15" w:name="voraussetzungen-für-die-nutzung"/>
-    <w:p>
-      <w:pPr>
-        <w:pStyle w:val="berschrift3"/>
-      </w:pPr>
-      <w:r>
-        <w:rPr>
-          <w:rStyle w:val="SectionNumber"/>
-        </w:rPr>
-        <w:t xml:space="preserve">1.2.2</w:t>
-      </w:r>
-      <w:r>
-        <w:tab/>
-      </w:r>
-      <w:r>
-        <w:t xml:space="preserve">2.2 Voraussetzungen für die Nutzung</w:t>
-      </w:r>
-    </w:p>
-    <w:bookmarkEnd w:id="15"/>
-    <w:bookmarkStart w:id="16" w:name="rollen-und-verantwortlichkeiten"/>
-    <w:p>
-      <w:pPr>
-        <w:pStyle w:val="berschrift3"/>
-      </w:pPr>
-      <w:r>
-        <w:rPr>
-          <w:rStyle w:val="SectionNumber"/>
-        </w:rPr>
-        <w:t xml:space="preserve">1.2.3</w:t>
-      </w:r>
-      <w:r>
-        <w:tab/>
-      </w:r>
-      <w:r>
-        <w:t xml:space="preserve">2.3 Rollen und Verantwortlichkeiten</w:t>
-      </w:r>
-    </w:p>
-    <w:bookmarkEnd w:id="16"/>
-    <w:bookmarkEnd w:id="17"/>
-    <w:bookmarkStart w:id="21" w:name="zugriff-und-berechtigungen"/>
-    <w:p>
-      <w:pPr>
-        <w:pStyle w:val="berschrift2"/>
-      </w:pPr>
-      <w:r>
-        <w:rPr>
-          <w:rStyle w:val="SectionNumber"/>
-        </w:rPr>
-        <w:t xml:space="preserve">1.3</w:t>
-      </w:r>
-      <w:r>
-        <w:tab/>
-      </w:r>
-      <w:r>
-        <w:t xml:space="preserve">3. Zugriff und Berechtigungen</w:t>
-      </w:r>
-    </w:p>
-    <w:bookmarkStart w:id="18" w:name="zugangswege"/>
-    <w:p>
-      <w:pPr>
-        <w:pStyle w:val="berschrift3"/>
-      </w:pPr>
-      <w:r>
-        <w:rPr>
-          <w:rStyle w:val="SectionNumber"/>
-        </w:rPr>
-        <w:t xml:space="preserve">1.3.1</w:t>
-      </w:r>
-      <w:r>
-        <w:tab/>
-      </w:r>
-      <w:r>
-        <w:t xml:space="preserve">3.1 Zugangswege</w:t>
-      </w:r>
-    </w:p>
-    <w:bookmarkEnd w:id="18"/>
-    <w:bookmarkStart w:id="19" w:name="rollen--und-rechtekonzept"/>
-    <w:p>
-      <w:pPr>
-        <w:pStyle w:val="berschrift3"/>
-      </w:pPr>
-      <w:r>
-        <w:rPr>
-          <w:rStyle w:val="SectionNumber"/>
-        </w:rPr>
-        <w:t xml:space="preserve">1.3.2</w:t>
-      </w:r>
-      <w:r>
-        <w:tab/>
-      </w:r>
-      <w:r>
-        <w:t xml:space="preserve">3.2 Rollen- und Rechtekonzept</w:t>
-      </w:r>
-    </w:p>
-    <w:bookmarkEnd w:id="19"/>
-    <w:bookmarkStart w:id="20" w:name="beantragung-von-berechtigungen"/>
-    <w:p>
-      <w:pPr>
-        <w:pStyle w:val="berschrift3"/>
-      </w:pPr>
-      <w:r>
-        <w:rPr>
-          <w:rStyle w:val="SectionNumber"/>
-        </w:rPr>
-        <w:t xml:space="preserve">1.3.3</w:t>
-      </w:r>
-      <w:r>
-        <w:tab/>
-      </w:r>
-      <w:r>
-        <w:t xml:space="preserve">3.3 Beantragung von Berechtigungen</w:t>
+        <w:t xml:space="preserve">Änderungsverlauf</w:t>
       </w:r>
     </w:p>
     <w:bookmarkEnd w:id="20"/>
     <w:bookmarkEnd w:id="21"/>
-    <w:bookmarkStart w:id="25" w:name="schritt-für-schritt-anleitung"/>
+    <w:bookmarkStart w:id="25" w:name="prozessüberblick"/>
     <w:p>
       <w:pPr>
         <w:pStyle w:val="berschrift2"/>
@@ -276,16 +594,16 @@
         <w:rPr>
           <w:rStyle w:val="SectionNumber"/>
         </w:rPr>
-        <w:t xml:space="preserve">1.4</w:t>
-      </w:r>
-      <w:r>
-        <w:tab/>
-      </w:r>
-      <w:r>
-        <w:t xml:space="preserve">4. Schritt-für-Schritt Anleitung</w:t>
-      </w:r>
-    </w:p>
-    <w:bookmarkStart w:id="22" w:name="start-des-prozesses"/>
+        <w:t xml:space="preserve">1.2</w:t>
+      </w:r>
+      <w:r>
+        <w:tab/>
+      </w:r>
+      <w:r>
+        <w:t xml:space="preserve">Prozessüberblick</w:t>
+      </w:r>
+    </w:p>
+    <w:bookmarkStart w:id="22" w:name="zweck-des-prozesses"/>
     <w:p>
       <w:pPr>
         <w:pStyle w:val="berschrift3"/>
@@ -294,17 +612,17 @@
         <w:rPr>
           <w:rStyle w:val="SectionNumber"/>
         </w:rPr>
-        <w:t xml:space="preserve">1.4.1</w:t>
-      </w:r>
-      <w:r>
-        <w:tab/>
-      </w:r>
-      <w:r>
-        <w:t xml:space="preserve">4.1 Start des Prozesses</w:t>
+        <w:t xml:space="preserve">1.2.1</w:t>
+      </w:r>
+      <w:r>
+        <w:tab/>
+      </w:r>
+      <w:r>
+        <w:t xml:space="preserve">Zweck des Prozesses</w:t>
       </w:r>
     </w:p>
     <w:bookmarkEnd w:id="22"/>
-    <w:bookmarkStart w:id="23" w:name="durchführung-der-kernschritte"/>
+    <w:bookmarkStart w:id="23" w:name="voraussetzungen-für-die-nutzung"/>
     <w:p>
       <w:pPr>
         <w:pStyle w:val="berschrift3"/>
@@ -313,17 +631,17 @@
         <w:rPr>
           <w:rStyle w:val="SectionNumber"/>
         </w:rPr>
-        <w:t xml:space="preserve">1.4.2</w:t>
-      </w:r>
-      <w:r>
-        <w:tab/>
-      </w:r>
-      <w:r>
-        <w:t xml:space="preserve">4.2 Durchführung der Kernschritte</w:t>
+        <w:t xml:space="preserve">1.2.2</w:t>
+      </w:r>
+      <w:r>
+        <w:tab/>
+      </w:r>
+      <w:r>
+        <w:t xml:space="preserve">Voraussetzungen für die Nutzung</w:t>
       </w:r>
     </w:p>
     <w:bookmarkEnd w:id="23"/>
-    <w:bookmarkStart w:id="24" w:name="abschluss-und-ergebnisprüfung"/>
+    <w:bookmarkStart w:id="24" w:name="rollen-und-verantwortlichkeiten"/>
     <w:p>
       <w:pPr>
         <w:pStyle w:val="berschrift3"/>
@@ -332,18 +650,18 @@
         <w:rPr>
           <w:rStyle w:val="SectionNumber"/>
         </w:rPr>
-        <w:t xml:space="preserve">1.4.3</w:t>
-      </w:r>
-      <w:r>
-        <w:tab/>
-      </w:r>
-      <w:r>
-        <w:t xml:space="preserve">4.3 Abschluss und Ergebnisprüfung</w:t>
+        <w:t xml:space="preserve">1.2.3</w:t>
+      </w:r>
+      <w:r>
+        <w:tab/>
+      </w:r>
+      <w:r>
+        <w:t xml:space="preserve">Rollen und Verantwortlichkeiten</w:t>
       </w:r>
     </w:p>
     <w:bookmarkEnd w:id="24"/>
     <w:bookmarkEnd w:id="25"/>
-    <w:bookmarkStart w:id="29" w:name="bedienoberfläche-und-screenshots"/>
+    <w:bookmarkStart w:id="29" w:name="zugriff-und-berechtigungen"/>
     <w:p>
       <w:pPr>
         <w:pStyle w:val="berschrift2"/>
@@ -352,16 +670,16 @@
         <w:rPr>
           <w:rStyle w:val="SectionNumber"/>
         </w:rPr>
-        <w:t xml:space="preserve">1.5</w:t>
-      </w:r>
-      <w:r>
-        <w:tab/>
-      </w:r>
-      <w:r>
-        <w:t xml:space="preserve">5. Bedienoberfläche und Screenshots</w:t>
-      </w:r>
-    </w:p>
-    <w:bookmarkStart w:id="26" w:name="übersicht-der-wichtigsten-masken"/>
+        <w:t xml:space="preserve">1.3</w:t>
+      </w:r>
+      <w:r>
+        <w:tab/>
+      </w:r>
+      <w:r>
+        <w:t xml:space="preserve">Zugriff und Berechtigungen</w:t>
+      </w:r>
+    </w:p>
+    <w:bookmarkStart w:id="26" w:name="zugangswege"/>
     <w:p>
       <w:pPr>
         <w:pStyle w:val="berschrift3"/>
@@ -370,17 +688,17 @@
         <w:rPr>
           <w:rStyle w:val="SectionNumber"/>
         </w:rPr>
-        <w:t xml:space="preserve">1.5.1</w:t>
-      </w:r>
-      <w:r>
-        <w:tab/>
-      </w:r>
-      <w:r>
-        <w:t xml:space="preserve">5.1 Übersicht der wichtigsten Masken</w:t>
+        <w:t xml:space="preserve">1.3.1</w:t>
+      </w:r>
+      <w:r>
+        <w:tab/>
+      </w:r>
+      <w:r>
+        <w:t xml:space="preserve">Zugangswege</w:t>
       </w:r>
     </w:p>
     <w:bookmarkEnd w:id="26"/>
-    <w:bookmarkStart w:id="27" w:name="feldbeschreibungen"/>
+    <w:bookmarkStart w:id="27" w:name="rollen--und-rechtekonzept"/>
     <w:p>
       <w:pPr>
         <w:pStyle w:val="berschrift3"/>
@@ -389,17 +707,17 @@
         <w:rPr>
           <w:rStyle w:val="SectionNumber"/>
         </w:rPr>
-        <w:t xml:space="preserve">1.5.2</w:t>
-      </w:r>
-      <w:r>
-        <w:tab/>
-      </w:r>
-      <w:r>
-        <w:t xml:space="preserve">5.2 Feldbeschreibungen</w:t>
+        <w:t xml:space="preserve">1.3.2</w:t>
+      </w:r>
+      <w:r>
+        <w:tab/>
+      </w:r>
+      <w:r>
+        <w:t xml:space="preserve">Rollen- und Rechtekonzept</w:t>
       </w:r>
     </w:p>
     <w:bookmarkEnd w:id="27"/>
-    <w:bookmarkStart w:id="28" w:name="beispielablauf-mit-screenshots"/>
+    <w:bookmarkStart w:id="28" w:name="beantragung-von-berechtigungen"/>
     <w:p>
       <w:pPr>
         <w:pStyle w:val="berschrift3"/>
@@ -408,18 +726,18 @@
         <w:rPr>
           <w:rStyle w:val="SectionNumber"/>
         </w:rPr>
-        <w:t xml:space="preserve">1.5.3</w:t>
-      </w:r>
-      <w:r>
-        <w:tab/>
-      </w:r>
-      <w:r>
-        <w:t xml:space="preserve">5.3 Beispielablauf mit Screenshots</w:t>
+        <w:t xml:space="preserve">1.3.3</w:t>
+      </w:r>
+      <w:r>
+        <w:tab/>
+      </w:r>
+      <w:r>
+        <w:t xml:space="preserve">Beantragung von Berechtigungen</w:t>
       </w:r>
     </w:p>
     <w:bookmarkEnd w:id="28"/>
     <w:bookmarkEnd w:id="29"/>
-    <w:bookmarkStart w:id="33" w:name="sonderfälle-und-fehlerbehandlung"/>
+    <w:bookmarkStart w:id="33" w:name="schritt-für-schritt-anleitung"/>
     <w:p>
       <w:pPr>
         <w:pStyle w:val="berschrift2"/>
@@ -428,16 +746,16 @@
         <w:rPr>
           <w:rStyle w:val="SectionNumber"/>
         </w:rPr>
-        <w:t xml:space="preserve">1.6</w:t>
-      </w:r>
-      <w:r>
-        <w:tab/>
-      </w:r>
-      <w:r>
-        <w:t xml:space="preserve">6. Sonderfälle und Fehlerbehandlung</w:t>
-      </w:r>
-    </w:p>
-    <w:bookmarkStart w:id="30" w:name="häufige-fehlerfälle"/>
+        <w:t xml:space="preserve">1.4</w:t>
+      </w:r>
+      <w:r>
+        <w:tab/>
+      </w:r>
+      <w:r>
+        <w:t xml:space="preserve">Schritt-für-Schritt Anleitung</w:t>
+      </w:r>
+    </w:p>
+    <w:bookmarkStart w:id="30" w:name="start-des-prozesses"/>
     <w:p>
       <w:pPr>
         <w:pStyle w:val="berschrift3"/>
@@ -446,17 +764,17 @@
         <w:rPr>
           <w:rStyle w:val="SectionNumber"/>
         </w:rPr>
-        <w:t xml:space="preserve">1.6.1</w:t>
-      </w:r>
-      <w:r>
-        <w:tab/>
-      </w:r>
-      <w:r>
-        <w:t xml:space="preserve">6.1 Häufige Fehlerfälle</w:t>
+        <w:t xml:space="preserve">1.4.1</w:t>
+      </w:r>
+      <w:r>
+        <w:tab/>
+      </w:r>
+      <w:r>
+        <w:t xml:space="preserve">Start des Prozesses</w:t>
       </w:r>
     </w:p>
     <w:bookmarkEnd w:id="30"/>
-    <w:bookmarkStart w:id="31" w:name="fehlerursachen-und-lösungen"/>
+    <w:bookmarkStart w:id="31" w:name="durchführung-der-kernschritte"/>
     <w:p>
       <w:pPr>
         <w:pStyle w:val="berschrift3"/>
@@ -465,17 +783,17 @@
         <w:rPr>
           <w:rStyle w:val="SectionNumber"/>
         </w:rPr>
-        <w:t xml:space="preserve">1.6.2</w:t>
-      </w:r>
-      <w:r>
-        <w:tab/>
-      </w:r>
-      <w:r>
-        <w:t xml:space="preserve">6.2 Fehlerursachen und Lösungen</w:t>
+        <w:t xml:space="preserve">1.4.2</w:t>
+      </w:r>
+      <w:r>
+        <w:tab/>
+      </w:r>
+      <w:r>
+        <w:t xml:space="preserve">Durchführung der Kernschritte</w:t>
       </w:r>
     </w:p>
     <w:bookmarkEnd w:id="31"/>
-    <w:bookmarkStart w:id="32" w:name="eskalationsweg-bei-störungen"/>
+    <w:bookmarkStart w:id="32" w:name="abschluss-und-ergebnisprüfung"/>
     <w:p>
       <w:pPr>
         <w:pStyle w:val="berschrift3"/>
@@ -484,18 +802,18 @@
         <w:rPr>
           <w:rStyle w:val="SectionNumber"/>
         </w:rPr>
-        <w:t xml:space="preserve">1.6.3</w:t>
-      </w:r>
-      <w:r>
-        <w:tab/>
-      </w:r>
-      <w:r>
-        <w:t xml:space="preserve">6.3 Eskalationsweg bei Störungen</w:t>
+        <w:t xml:space="preserve">1.4.3</w:t>
+      </w:r>
+      <w:r>
+        <w:tab/>
+      </w:r>
+      <w:r>
+        <w:t xml:space="preserve">Abschluss und Ergebnisprüfung</w:t>
       </w:r>
     </w:p>
     <w:bookmarkEnd w:id="32"/>
     <w:bookmarkEnd w:id="33"/>
-    <w:bookmarkStart w:id="37" w:name="faq"/>
+    <w:bookmarkStart w:id="37" w:name="bedienoberfläche-und-screenshots"/>
     <w:p>
       <w:pPr>
         <w:pStyle w:val="berschrift2"/>
@@ -504,16 +822,16 @@
         <w:rPr>
           <w:rStyle w:val="SectionNumber"/>
         </w:rPr>
-        <w:t xml:space="preserve">1.7</w:t>
-      </w:r>
-      <w:r>
-        <w:tab/>
-      </w:r>
-      <w:r>
-        <w:t xml:space="preserve">7. FAQ</w:t>
-      </w:r>
-    </w:p>
-    <w:bookmarkStart w:id="34" w:name="häufig-gestellte-fragen"/>
+        <w:t xml:space="preserve">1.5</w:t>
+      </w:r>
+      <w:r>
+        <w:tab/>
+      </w:r>
+      <w:r>
+        <w:t xml:space="preserve">Bedienoberfläche und Screenshots</w:t>
+      </w:r>
+    </w:p>
+    <w:bookmarkStart w:id="34" w:name="übersicht-der-wichtigsten-masken"/>
     <w:p>
       <w:pPr>
         <w:pStyle w:val="berschrift3"/>
@@ -522,17 +840,17 @@
         <w:rPr>
           <w:rStyle w:val="SectionNumber"/>
         </w:rPr>
-        <w:t xml:space="preserve">1.7.1</w:t>
-      </w:r>
-      <w:r>
-        <w:tab/>
-      </w:r>
-      <w:r>
-        <w:t xml:space="preserve">7.1 Häufig gestellte Fragen</w:t>
+        <w:t xml:space="preserve">1.5.1</w:t>
+      </w:r>
+      <w:r>
+        <w:tab/>
+      </w:r>
+      <w:r>
+        <w:t xml:space="preserve">Übersicht der wichtigsten Masken</w:t>
       </w:r>
     </w:p>
     <w:bookmarkEnd w:id="34"/>
-    <w:bookmarkStart w:id="35" w:name="kurzantworten-und-tipps"/>
+    <w:bookmarkStart w:id="35" w:name="feldbeschreibungen"/>
     <w:p>
       <w:pPr>
         <w:pStyle w:val="berschrift3"/>
@@ -541,17 +859,17 @@
         <w:rPr>
           <w:rStyle w:val="SectionNumber"/>
         </w:rPr>
-        <w:t xml:space="preserve">1.7.2</w:t>
-      </w:r>
-      <w:r>
-        <w:tab/>
-      </w:r>
-      <w:r>
-        <w:t xml:space="preserve">7.2 Kurzantworten und Tipps</w:t>
+        <w:t xml:space="preserve">1.5.2</w:t>
+      </w:r>
+      <w:r>
+        <w:tab/>
+      </w:r>
+      <w:r>
+        <w:t xml:space="preserve">Feldbeschreibungen</w:t>
       </w:r>
     </w:p>
     <w:bookmarkEnd w:id="35"/>
-    <w:bookmarkStart w:id="36" w:name="verweise-auf-weiterführende-infos"/>
+    <w:bookmarkStart w:id="36" w:name="beispielablauf-mit-screenshots"/>
     <w:p>
       <w:pPr>
         <w:pStyle w:val="berschrift3"/>
@@ -560,18 +878,18 @@
         <w:rPr>
           <w:rStyle w:val="SectionNumber"/>
         </w:rPr>
-        <w:t xml:space="preserve">1.7.3</w:t>
-      </w:r>
-      <w:r>
-        <w:tab/>
-      </w:r>
-      <w:r>
-        <w:t xml:space="preserve">7.3 Verweise auf weiterführende Infos</w:t>
+        <w:t xml:space="preserve">1.5.3</w:t>
+      </w:r>
+      <w:r>
+        <w:tab/>
+      </w:r>
+      <w:r>
+        <w:t xml:space="preserve">Beispielablauf mit Screenshots</w:t>
       </w:r>
     </w:p>
     <w:bookmarkEnd w:id="36"/>
     <w:bookmarkEnd w:id="37"/>
-    <w:bookmarkStart w:id="41" w:name="betriebshinweise-für-anwender"/>
+    <w:bookmarkStart w:id="41" w:name="sonderfälle-und-fehlerbehandlung"/>
     <w:p>
       <w:pPr>
         <w:pStyle w:val="berschrift2"/>
@@ -580,16 +898,16 @@
         <w:rPr>
           <w:rStyle w:val="SectionNumber"/>
         </w:rPr>
-        <w:t xml:space="preserve">1.8</w:t>
-      </w:r>
-      <w:r>
-        <w:tab/>
-      </w:r>
-      <w:r>
-        <w:t xml:space="preserve">8. Betriebshinweise für Anwender</w:t>
-      </w:r>
-    </w:p>
-    <w:bookmarkStart w:id="38" w:name="wartungsfenster-und-verfügbarkeit"/>
+        <w:t xml:space="preserve">1.6</w:t>
+      </w:r>
+      <w:r>
+        <w:tab/>
+      </w:r>
+      <w:r>
+        <w:t xml:space="preserve">Sonderfälle und Fehlerbehandlung</w:t>
+      </w:r>
+    </w:p>
+    <w:bookmarkStart w:id="38" w:name="häufige-fehlerfälle"/>
     <w:p>
       <w:pPr>
         <w:pStyle w:val="berschrift3"/>
@@ -598,17 +916,17 @@
         <w:rPr>
           <w:rStyle w:val="SectionNumber"/>
         </w:rPr>
-        <w:t xml:space="preserve">1.8.1</w:t>
-      </w:r>
-      <w:r>
-        <w:tab/>
-      </w:r>
-      <w:r>
-        <w:t xml:space="preserve">8.1 Wartungsfenster und Verfügbarkeit</w:t>
+        <w:t xml:space="preserve">1.6.1</w:t>
+      </w:r>
+      <w:r>
+        <w:tab/>
+      </w:r>
+      <w:r>
+        <w:t xml:space="preserve">Häufige Fehlerfälle</w:t>
       </w:r>
     </w:p>
     <w:bookmarkEnd w:id="38"/>
-    <w:bookmarkStart w:id="39" w:name="datenschutz--und-sicherheitshinweise"/>
+    <w:bookmarkStart w:id="39" w:name="fehlerursachen-und-lösungen"/>
     <w:p>
       <w:pPr>
         <w:pStyle w:val="berschrift3"/>
@@ -617,17 +935,17 @@
         <w:rPr>
           <w:rStyle w:val="SectionNumber"/>
         </w:rPr>
-        <w:t xml:space="preserve">1.8.2</w:t>
-      </w:r>
-      <w:r>
-        <w:tab/>
-      </w:r>
-      <w:r>
-        <w:t xml:space="preserve">8.2 Datenschutz- und Sicherheitshinweise</w:t>
+        <w:t xml:space="preserve">1.6.2</w:t>
+      </w:r>
+      <w:r>
+        <w:tab/>
+      </w:r>
+      <w:r>
+        <w:t xml:space="preserve">Fehlerursachen und Lösungen</w:t>
       </w:r>
     </w:p>
     <w:bookmarkEnd w:id="39"/>
-    <w:bookmarkStart w:id="40" w:name="aufbewahrung-und-nachvollziehbarkeit"/>
+    <w:bookmarkStart w:id="40" w:name="eskalationsweg-bei-störungen"/>
     <w:p>
       <w:pPr>
         <w:pStyle w:val="berschrift3"/>
@@ -636,18 +954,18 @@
         <w:rPr>
           <w:rStyle w:val="SectionNumber"/>
         </w:rPr>
-        <w:t xml:space="preserve">1.8.3</w:t>
-      </w:r>
-      <w:r>
-        <w:tab/>
-      </w:r>
-      <w:r>
-        <w:t xml:space="preserve">8.3 Aufbewahrung und Nachvollziehbarkeit</w:t>
+        <w:t xml:space="preserve">1.6.3</w:t>
+      </w:r>
+      <w:r>
+        <w:tab/>
+      </w:r>
+      <w:r>
+        <w:t xml:space="preserve">Eskalationsweg bei Störungen</w:t>
       </w:r>
     </w:p>
     <w:bookmarkEnd w:id="40"/>
     <w:bookmarkEnd w:id="41"/>
-    <w:bookmarkStart w:id="45" w:name="ansprechpartner-und-support"/>
+    <w:bookmarkStart w:id="45" w:name="faq"/>
     <w:p>
       <w:pPr>
         <w:pStyle w:val="berschrift2"/>
@@ -656,16 +974,16 @@
         <w:rPr>
           <w:rStyle w:val="SectionNumber"/>
         </w:rPr>
-        <w:t xml:space="preserve">1.9</w:t>
-      </w:r>
-      <w:r>
-        <w:tab/>
-      </w:r>
-      <w:r>
-        <w:t xml:space="preserve">9. Ansprechpartner und Support</w:t>
-      </w:r>
-    </w:p>
-    <w:bookmarkStart w:id="42" w:name="fachlicher-ansprechpartner"/>
+        <w:t xml:space="preserve">1.7</w:t>
+      </w:r>
+      <w:r>
+        <w:tab/>
+      </w:r>
+      <w:r>
+        <w:t xml:space="preserve">FAQ</w:t>
+      </w:r>
+    </w:p>
+    <w:bookmarkStart w:id="42" w:name="häufig-gestellte-fragen"/>
     <w:p>
       <w:pPr>
         <w:pStyle w:val="berschrift3"/>
@@ -674,17 +992,17 @@
         <w:rPr>
           <w:rStyle w:val="SectionNumber"/>
         </w:rPr>
-        <w:t xml:space="preserve">1.9.1</w:t>
-      </w:r>
-      <w:r>
-        <w:tab/>
-      </w:r>
-      <w:r>
-        <w:t xml:space="preserve">9.1 Fachlicher Ansprechpartner</w:t>
+        <w:t xml:space="preserve">1.7.1</w:t>
+      </w:r>
+      <w:r>
+        <w:tab/>
+      </w:r>
+      <w:r>
+        <w:t xml:space="preserve">Häufig gestellte Fragen</w:t>
       </w:r>
     </w:p>
     <w:bookmarkEnd w:id="42"/>
-    <w:bookmarkStart w:id="43" w:name="technischer-support"/>
+    <w:bookmarkStart w:id="43" w:name="kurzantworten-und-tipps"/>
     <w:p>
       <w:pPr>
         <w:pStyle w:val="berschrift3"/>
@@ -693,17 +1011,17 @@
         <w:rPr>
           <w:rStyle w:val="SectionNumber"/>
         </w:rPr>
-        <w:t xml:space="preserve">1.9.2</w:t>
-      </w:r>
-      <w:r>
-        <w:tab/>
-      </w:r>
-      <w:r>
-        <w:t xml:space="preserve">9.2 Technischer Support</w:t>
+        <w:t xml:space="preserve">1.7.2</w:t>
+      </w:r>
+      <w:r>
+        <w:tab/>
+      </w:r>
+      <w:r>
+        <w:t xml:space="preserve">Kurzantworten und Tipps</w:t>
       </w:r>
     </w:p>
     <w:bookmarkEnd w:id="43"/>
-    <w:bookmarkStart w:id="44" w:name="kommunikationskanäle-und-zeiten"/>
+    <w:bookmarkStart w:id="44" w:name="verweise-auf-weiterführende-infos"/>
     <w:p>
       <w:pPr>
         <w:pStyle w:val="berschrift3"/>
@@ -712,21 +1030,175 @@
         <w:rPr>
           <w:rStyle w:val="SectionNumber"/>
         </w:rPr>
-        <w:t xml:space="preserve">1.9.3</w:t>
-      </w:r>
-      <w:r>
-        <w:tab/>
-      </w:r>
-      <w:r>
-        <w:t xml:space="preserve">9.3 Kommunikationskanäle und Zeiten</w:t>
+        <w:t xml:space="preserve">1.7.3</w:t>
+      </w:r>
+      <w:r>
+        <w:tab/>
+      </w:r>
+      <w:r>
+        <w:t xml:space="preserve">Verweise auf weiterführende Infos</w:t>
       </w:r>
     </w:p>
     <w:bookmarkEnd w:id="44"/>
     <w:bookmarkEnd w:id="45"/>
+    <w:bookmarkStart w:id="49" w:name="betriebshinweise-für-anwender"/>
+    <w:p>
+      <w:pPr>
+        <w:pStyle w:val="berschrift2"/>
+      </w:pPr>
+      <w:r>
+        <w:rPr>
+          <w:rStyle w:val="SectionNumber"/>
+        </w:rPr>
+        <w:t xml:space="preserve">1.8</w:t>
+      </w:r>
+      <w:r>
+        <w:tab/>
+      </w:r>
+      <w:r>
+        <w:t xml:space="preserve">Betriebshinweise für Anwender</w:t>
+      </w:r>
+    </w:p>
+    <w:bookmarkStart w:id="46" w:name="wartungsfenster-und-verfügbarkeit"/>
+    <w:p>
+      <w:pPr>
+        <w:pStyle w:val="berschrift3"/>
+      </w:pPr>
+      <w:r>
+        <w:rPr>
+          <w:rStyle w:val="SectionNumber"/>
+        </w:rPr>
+        <w:t xml:space="preserve">1.8.1</w:t>
+      </w:r>
+      <w:r>
+        <w:tab/>
+      </w:r>
+      <w:r>
+        <w:t xml:space="preserve">Wartungsfenster und Verfügbarkeit</w:t>
+      </w:r>
+    </w:p>
     <w:bookmarkEnd w:id="46"/>
+    <w:bookmarkStart w:id="47" w:name="datenschutz--und-sicherheitshinweise"/>
+    <w:p>
+      <w:pPr>
+        <w:pStyle w:val="berschrift3"/>
+      </w:pPr>
+      <w:r>
+        <w:rPr>
+          <w:rStyle w:val="SectionNumber"/>
+        </w:rPr>
+        <w:t xml:space="preserve">1.8.2</w:t>
+      </w:r>
+      <w:r>
+        <w:tab/>
+      </w:r>
+      <w:r>
+        <w:t xml:space="preserve">Datenschutz- und Sicherheitshinweise</w:t>
+      </w:r>
+    </w:p>
+    <w:bookmarkEnd w:id="47"/>
+    <w:bookmarkStart w:id="48" w:name="aufbewahrung-und-nachvollziehbarkeit"/>
+    <w:p>
+      <w:pPr>
+        <w:pStyle w:val="berschrift3"/>
+      </w:pPr>
+      <w:r>
+        <w:rPr>
+          <w:rStyle w:val="SectionNumber"/>
+        </w:rPr>
+        <w:t xml:space="preserve">1.8.3</w:t>
+      </w:r>
+      <w:r>
+        <w:tab/>
+      </w:r>
+      <w:r>
+        <w:t xml:space="preserve">Aufbewahrung und Nachvollziehbarkeit</w:t>
+      </w:r>
+    </w:p>
+    <w:bookmarkEnd w:id="48"/>
+    <w:bookmarkEnd w:id="49"/>
+    <w:bookmarkStart w:id="53" w:name="ansprechpartner-und-support"/>
+    <w:p>
+      <w:pPr>
+        <w:pStyle w:val="berschrift2"/>
+      </w:pPr>
+      <w:r>
+        <w:rPr>
+          <w:rStyle w:val="SectionNumber"/>
+        </w:rPr>
+        <w:t xml:space="preserve">1.9</w:t>
+      </w:r>
+      <w:r>
+        <w:tab/>
+      </w:r>
+      <w:r>
+        <w:t xml:space="preserve">Ansprechpartner und Support</w:t>
+      </w:r>
+    </w:p>
+    <w:bookmarkStart w:id="50" w:name="fachlicher-ansprechpartner"/>
+    <w:p>
+      <w:pPr>
+        <w:pStyle w:val="berschrift3"/>
+      </w:pPr>
+      <w:r>
+        <w:rPr>
+          <w:rStyle w:val="SectionNumber"/>
+        </w:rPr>
+        <w:t xml:space="preserve">1.9.1</w:t>
+      </w:r>
+      <w:r>
+        <w:tab/>
+      </w:r>
+      <w:r>
+        <w:t xml:space="preserve">Fachlicher Ansprechpartner</w:t>
+      </w:r>
+    </w:p>
+    <w:bookmarkEnd w:id="50"/>
+    <w:bookmarkStart w:id="51" w:name="technischer-support"/>
+    <w:p>
+      <w:pPr>
+        <w:pStyle w:val="berschrift3"/>
+      </w:pPr>
+      <w:r>
+        <w:rPr>
+          <w:rStyle w:val="SectionNumber"/>
+        </w:rPr>
+        <w:t xml:space="preserve">1.9.2</w:t>
+      </w:r>
+      <w:r>
+        <w:tab/>
+      </w:r>
+      <w:r>
+        <w:t xml:space="preserve">Technischer Support</w:t>
+      </w:r>
+    </w:p>
+    <w:bookmarkEnd w:id="51"/>
+    <w:bookmarkStart w:id="52" w:name="kommunikationskanäle-und-zeiten"/>
+    <w:p>
+      <w:pPr>
+        <w:pStyle w:val="berschrift3"/>
+      </w:pPr>
+      <w:r>
+        <w:rPr>
+          <w:rStyle w:val="SectionNumber"/>
+        </w:rPr>
+        <w:t xml:space="preserve">1.9.3</w:t>
+      </w:r>
+      <w:r>
+        <w:tab/>
+      </w:r>
+      <w:r>
+        <w:t xml:space="preserve">Kommunikationskanäle und Zeiten</w:t>
+      </w:r>
+    </w:p>
+    <w:bookmarkEnd w:id="52"/>
+    <w:bookmarkEnd w:id="53"/>
+    <w:bookmarkEnd w:id="54"/>
     <w:sectPr>
+      <w:headerReference r:id="rId7" w:type="default"/>
+      <w:footerReference r:id="rId8" w:type="default"/>
       <w:pgSz w:h="16838" w:w="11906"/>
-      <w:pgMar w:bottom="1134" w:footer="708" w:gutter="0" w:header="708" w:left="1417" w:right="1417" w:top="1417"/>
+      <w:pgMar w:bottom="1985" w:footer="0" w:gutter="0" w:header="1814" w:left="1418" w:right="851" w:top="2722"/>
       <w:cols w:space="708"/>
       <w:docGrid w:linePitch="360"/>
     </w:sectPr>
@@ -738,6 +1210,234 @@
 <w:comments xmlns:w="http://schemas.openxmlformats.org/wordprocessingml/2006/main" xmlns:m="http://schemas.openxmlformats.org/officeDocument/2006/math" xmlns:r="http://schemas.openxmlformats.org/officeDocument/2006/relationships" xmlns:o="urn:schemas-microsoft-com:office:office" xmlns:v="urn:schemas-microsoft-com:vml" xmlns:w10="urn:schemas-microsoft-com:office:word" xmlns:a="http://schemas.openxmlformats.org/drawingml/2006/main" xmlns:pic="http://schemas.openxmlformats.org/drawingml/2006/picture" xmlns:wp="http://schemas.openxmlformats.org/drawingml/2006/wordprocessingDrawing"/>
 </file>
 
+<file path=word/footer1.xml><?xml version="1.0" encoding="utf-8"?>
+<w:ftr xmlns:wpc="http://schemas.microsoft.com/office/word/2010/wordprocessingCanvas" xmlns:cx="http://schemas.microsoft.com/office/drawing/2014/chartex" xmlns:cx1="http://schemas.microsoft.com/office/drawing/2015/9/8/chartex" xmlns:cx2="http://schemas.microsoft.com/office/drawing/2015/10/21/chartex" xmlns:cx3="http://schemas.microsoft.com/office/drawing/2016/5/9/chartex" xmlns:cx4="http://schemas.microsoft.com/office/drawing/2016/5/10/chartex" xmlns:cx5="http://schemas.microsoft.com/office/drawing/2016/5/11/chartex" xmlns:cx6="http://schemas.microsoft.com/office/drawing/2016/5/12/chartex" xmlns:cx7="http://schemas.microsoft.com/office/drawing/2016/5/13/chartex" xmlns:cx8="http://schemas.microsoft.com/office/drawing/2016/5/14/chartex" xmlns:mc="http://schemas.openxmlformats.org/markup-compatibility/2006" xmlns:aink="http://schemas.microsoft.com/office/drawing/2016/ink" xmlns:am3d="http://schemas.microsoft.com/office/drawing/2017/model3d" xmlns:o="urn:schemas-microsoft-com:office:office" xmlns:oel="http://schemas.microsoft.com/office/2019/extlst" xmlns:r="http://schemas.openxmlformats.org/officeDocument/2006/relationships" xmlns:m="http://schemas.openxmlformats.org/officeDocument/2006/math" xmlns:v="urn:schemas-microsoft-com:vml" xmlns:wp14="http://schemas.microsoft.com/office/word/2010/wordprocessingDrawing" xmlns:wp="http://schemas.openxmlformats.org/drawingml/2006/wordprocessingDrawing" xmlns:w10="urn:schemas-microsoft-com:office:word" xmlns:w="http://schemas.openxmlformats.org/wordprocessingml/2006/main" xmlns:w14="http://schemas.microsoft.com/office/word/2010/wordml" xmlns:w15="http://schemas.microsoft.com/office/word/2012/wordml" xmlns:w16cex="http://schemas.microsoft.com/office/word/2018/wordml/cex" xmlns:w16cid="http://schemas.microsoft.com/office/word/2016/wordml/cid" xmlns:w16="http://schemas.microsoft.com/office/word/2018/wordml" xmlns:w16du="http://schemas.microsoft.com/office/word/2023/wordml/word16du" xmlns:w16sdtdh="http://schemas.microsoft.com/office/word/2020/wordml/sdtdatahash" xmlns:w16sdtfl="http://schemas.microsoft.com/office/word/2024/wordml/sdtformatlock" xmlns:w16se="http://schemas.microsoft.com/office/word/2015/wordml/symex" xmlns:wpg="http://schemas.microsoft.com/office/word/2010/wordprocessingGroup" xmlns:wpi="http://schemas.microsoft.com/office/word/2010/wordprocessingInk" xmlns:wne="http://schemas.microsoft.com/office/word/2006/wordml" xmlns:wps="http://schemas.microsoft.com/office/word/2010/wordprocessingShape" mc:Ignorable="w14 w15 w16se w16cid w16 w16cex w16sdtdh w16sdtfl w16du wp14">
+  <w:p>
+    <w:pPr>
+      <w:pStyle w:val="Fuzeile"/>
+      <w:spacing w:after="240"/>
+      <w:jc w:val="center"/>
+    </w:pPr>
+    <w:r>
+      <w:rPr>
+        <w:noProof/>
+      </w:rPr>
+      <mc:AlternateContent>
+        <mc:Choice Requires="wps">
+          <w:drawing>
+            <wp:anchor distT="0" distB="0" distL="114300" distR="114300" simplePos="0" relativeHeight="251659264" behindDoc="0" locked="0" layoutInCell="1" allowOverlap="1" wp14:anchorId="00ABD90B" wp14:editId="42722E54">
+              <wp:simplePos x="0" y="0"/>
+              <wp:positionH relativeFrom="margin">
+                <wp:align>right</wp:align>
+              </wp:positionH>
+              <wp:positionV relativeFrom="paragraph">
+                <wp:posOffset>-687070</wp:posOffset>
+              </wp:positionV>
+              <wp:extent cx="615950" cy="260350"/>
+              <wp:effectExtent l="0" t="0" r="12700" b="6350"/>
+              <wp:wrapNone/>
+              <wp:docPr id="1158574423" name="Textfeld 5"/>
+              <wp:cNvGraphicFramePr/>
+              <a:graphic xmlns:a="http://schemas.openxmlformats.org/drawingml/2006/main">
+                <a:graphicData uri="http://schemas.microsoft.com/office/word/2010/wordprocessingShape">
+                  <wps:wsp>
+                    <wps:cNvSpPr txBox="1"/>
+                    <wps:spPr>
+                      <a:xfrm>
+                        <a:off x="0" y="0"/>
+                        <a:ext cx="615950" cy="260350"/>
+                      </a:xfrm>
+                      <a:prstGeom prst="rect">
+                        <a:avLst/>
+                      </a:prstGeom>
+                      <a:noFill/>
+                      <a:ln w="6350">
+                        <a:noFill/>
+                      </a:ln>
+                    </wps:spPr>
+                    <wps:txbx>
+                      <w:txbxContent>
+                        <w:p>
+                          <w:pPr>
+                            <w:jc w:val="right"/>
+                            <w:rPr>
+                              <w:color w:val="002060"/>
+                            </w:rPr>
+                          </w:pPr>
+                          <w:r>
+                            <w:rPr>
+                              <w:color w:val="002060"/>
+                            </w:rPr>
+                            <w:fldChar w:fldCharType="begin"/>
+                          </w:r>
+                          <w:r>
+                            <w:rPr>
+                              <w:color w:val="002060"/>
+                            </w:rPr>
+                            <w:instrText>PAGE   \* MERGEFORMAT</w:instrText>
+                          </w:r>
+                          <w:r>
+                            <w:rPr>
+                              <w:color w:val="002060"/>
+                            </w:rPr>
+                            <w:fldChar w:fldCharType="separate"/>
+                          </w:r>
+                          <w:r>
+                            <w:rPr>
+                              <w:color w:val="002060"/>
+                            </w:rPr>
+                            <w:t>1</w:t>
+                          </w:r>
+                          <w:r>
+                            <w:rPr>
+                              <w:color w:val="002060"/>
+                            </w:rPr>
+                            <w:fldChar w:fldCharType="end"/>
+                          </w:r>
+                        </w:p>
+                      </w:txbxContent>
+                    </wps:txbx>
+                    <wps:bodyPr rot="0" spcFirstLastPara="0" vertOverflow="overflow" horzOverflow="overflow" vert="horz" wrap="square" lIns="91440" tIns="45720" rIns="0" bIns="45720" numCol="1" spcCol="0" rtlCol="0" fromWordArt="0" anchor="t" anchorCtr="0" forceAA="0" compatLnSpc="1">
+                      <a:prstTxWarp prst="textNoShape">
+                        <a:avLst/>
+                      </a:prstTxWarp>
+                      <a:noAutofit/>
+                    </wps:bodyPr>
+                  </wps:wsp>
+                </a:graphicData>
+              </a:graphic>
+              <wp14:sizeRelH relativeFrom="margin">
+                <wp14:pctWidth>0</wp14:pctWidth>
+              </wp14:sizeRelH>
+              <wp14:sizeRelV relativeFrom="margin">
+                <wp14:pctHeight>0</wp14:pctHeight>
+              </wp14:sizeRelV>
+            </wp:anchor>
+          </w:drawing>
+        </mc:Choice>
+        <mc:Fallback>
+          <w:pict>
+            <v:shapetype w14:anchorId="00ABD90B" id="_x0000_t202" coordsize="21600,21600" o:spt="202" path="m,l,21600r21600,l21600,xe">
+              <v:stroke joinstyle="miter"/>
+              <v:path gradientshapeok="t" o:connecttype="rect"/>
+            </v:shapetype>
+            <v:shape id="Textfeld 5" o:spid="_x0000_s1026" type="#_x0000_t202" style="position:absolute;left:0;text-align:left;margin-left:-2.7pt;margin-top:-54.1pt;width:48.5pt;height:20.5pt;z-index:251659264;visibility:visible;mso-wrap-style:square;mso-width-percent:0;mso-height-percent:0;mso-wrap-distance-left:9pt;mso-wrap-distance-top:0;mso-wrap-distance-right:9pt;mso-wrap-distance-bottom:0;mso-position-horizontal:right;mso-position-horizontal-relative:margin;mso-position-vertical:absolute;mso-position-vertical-relative:text;mso-width-percent:0;mso-height-percent:0;mso-width-relative:margin;mso-height-relative:margin;v-text-anchor:top" o:gfxdata="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" filled="f" stroked="f" strokeweight=".5pt">
+              <v:textbox inset=",,0">
+                <w:txbxContent>
+                  <w:p>
+                    <w:pPr>
+                      <w:jc w:val="right"/>
+                      <w:rPr>
+                        <w:color w:val="002060"/>
+                      </w:rPr>
+                    </w:pPr>
+                    <w:r>
+                      <w:rPr>
+                        <w:color w:val="002060"/>
+                      </w:rPr>
+                      <w:fldChar w:fldCharType="begin"/>
+                    </w:r>
+                    <w:r>
+                      <w:rPr>
+                        <w:color w:val="002060"/>
+                      </w:rPr>
+                      <w:instrText>PAGE   \* MERGEFORMAT</w:instrText>
+                    </w:r>
+                    <w:r>
+                      <w:rPr>
+                        <w:color w:val="002060"/>
+                      </w:rPr>
+                      <w:fldChar w:fldCharType="separate"/>
+                    </w:r>
+                    <w:r>
+                      <w:rPr>
+                        <w:color w:val="002060"/>
+                      </w:rPr>
+                      <w:t>1</w:t>
+                    </w:r>
+                    <w:r>
+                      <w:rPr>
+                        <w:color w:val="002060"/>
+                      </w:rPr>
+                      <w:fldChar w:fldCharType="end"/>
+                    </w:r>
+                  </w:p>
+                </w:txbxContent>
+              </v:textbox>
+              <w10:wrap anchorx="margin"/>
+            </v:shape>
+          </w:pict>
+        </mc:Fallback>
+      </mc:AlternateContent>
+    </w:r>
+    <w:r>
+      <w:rPr>
+        <w:noProof/>
+      </w:rPr>
+      <w:drawing>
+        <wp:anchor distT="0" distB="0" distL="114300" distR="114300" simplePos="0" relativeHeight="251658240" behindDoc="1" locked="0" layoutInCell="1" allowOverlap="1" wp14:anchorId="02969C57" wp14:editId="61128673">
+          <wp:simplePos x="0" y="0"/>
+          <wp:positionH relativeFrom="page">
+            <wp:align>left</wp:align>
+          </wp:positionH>
+          <wp:positionV relativeFrom="paragraph">
+            <wp:posOffset>-198120</wp:posOffset>
+          </wp:positionV>
+          <wp:extent cx="7620635" cy="499745"/>
+          <wp:effectExtent l="0" t="0" r="0" b="0"/>
+          <wp:wrapNone/>
+          <wp:docPr id="1019978473" name="Grafik 4"/>
+          <wp:cNvGraphicFramePr>
+            <a:graphicFrameLocks xmlns:a="http://schemas.openxmlformats.org/drawingml/2006/main" noChangeAspect="1"/>
+          </wp:cNvGraphicFramePr>
+          <a:graphic xmlns:a="http://schemas.openxmlformats.org/drawingml/2006/main">
+            <a:graphicData uri="http://schemas.openxmlformats.org/drawingml/2006/picture">
+              <pic:pic xmlns:pic="http://schemas.openxmlformats.org/drawingml/2006/picture">
+                <pic:nvPicPr>
+                  <pic:cNvPr id="0" name="Picture 2"/>
+                  <pic:cNvPicPr>
+                    <a:picLocks noChangeAspect="1" noChangeArrowheads="1"/>
+                  </pic:cNvPicPr>
+                </pic:nvPicPr>
+                <pic:blipFill>
+                  <a:blip r:embed="rId1">
+                    <a:extLst>
+                      <a:ext uri="{28A0092B-C50C-407E-A947-70E740481C1C}">
+                        <a14:useLocalDpi xmlns:a14="http://schemas.microsoft.com/office/drawing/2010/main" val="0"/>
+                      </a:ext>
+                    </a:extLst>
+                  </a:blip>
+                  <a:srcRect/>
+                  <a:stretch>
+                    <a:fillRect/>
+                  </a:stretch>
+                </pic:blipFill>
+                <pic:spPr bwMode="auto">
+                  <a:xfrm>
+                    <a:off x="0" y="0"/>
+                    <a:ext cx="7620635" cy="499745"/>
+                  </a:xfrm>
+                  <a:prstGeom prst="rect">
+                    <a:avLst/>
+                  </a:prstGeom>
+                  <a:noFill/>
+                </pic:spPr>
+              </pic:pic>
+            </a:graphicData>
+          </a:graphic>
+          <wp14:sizeRelH relativeFrom="page">
+            <wp14:pctWidth>0</wp14:pctWidth>
+          </wp14:sizeRelH>
+          <wp14:sizeRelV relativeFrom="page">
+            <wp14:pctHeight>0</wp14:pctHeight>
+          </wp14:sizeRelV>
+        </wp:anchor>
+      </w:drawing>
+    </w:r>
+  </w:p>
+</w:ftr>
+</file>
+
 <file path=word/footnotes.xml><?xml version="1.0" encoding="utf-8"?>
 <w:footnotes xmlns:w="http://schemas.openxmlformats.org/wordprocessingml/2006/main" xmlns:m="http://schemas.openxmlformats.org/officeDocument/2006/math" xmlns:r="http://schemas.openxmlformats.org/officeDocument/2006/relationships" xmlns:o="urn:schemas-microsoft-com:office:office" xmlns:v="urn:schemas-microsoft-com:vml" xmlns:w10="urn:schemas-microsoft-com:office:word" xmlns:a="http://schemas.openxmlformats.org/drawingml/2006/main" xmlns:pic="http://schemas.openxmlformats.org/drawingml/2006/picture" xmlns:wp="http://schemas.openxmlformats.org/drawingml/2006/wordprocessingDrawing">
   <w:footnote w:type="continuationSeparator" w:id="0">
@@ -755,6 +1455,80 @@
     </w:p>
   </w:footnote>
 </w:footnotes>
+</file>
+
+<file path=word/header1.xml><?xml version="1.0" encoding="utf-8"?>
+<w:hdr xmlns:wpc="http://schemas.microsoft.com/office/word/2010/wordprocessingCanvas" xmlns:cx="http://schemas.microsoft.com/office/drawing/2014/chartex" xmlns:cx1="http://schemas.microsoft.com/office/drawing/2015/9/8/chartex" xmlns:cx2="http://schemas.microsoft.com/office/drawing/2015/10/21/chartex" xmlns:cx3="http://schemas.microsoft.com/office/drawing/2016/5/9/chartex" xmlns:cx4="http://schemas.microsoft.com/office/drawing/2016/5/10/chartex" xmlns:cx5="http://schemas.microsoft.com/office/drawing/2016/5/11/chartex" xmlns:cx6="http://schemas.microsoft.com/office/drawing/2016/5/12/chartex" xmlns:cx7="http://schemas.microsoft.com/office/drawing/2016/5/13/chartex" xmlns:cx8="http://schemas.microsoft.com/office/drawing/2016/5/14/chartex" xmlns:mc="http://schemas.openxmlformats.org/markup-compatibility/2006" xmlns:aink="http://schemas.microsoft.com/office/drawing/2016/ink" xmlns:am3d="http://schemas.microsoft.com/office/drawing/2017/model3d" xmlns:o="urn:schemas-microsoft-com:office:office" xmlns:oel="http://schemas.microsoft.com/office/2019/extlst" xmlns:r="http://schemas.openxmlformats.org/officeDocument/2006/relationships" xmlns:m="http://schemas.openxmlformats.org/officeDocument/2006/math" xmlns:v="urn:schemas-microsoft-com:vml" xmlns:wp14="http://schemas.microsoft.com/office/word/2010/wordprocessingDrawing" xmlns:wp="http://schemas.openxmlformats.org/drawingml/2006/wordprocessingDrawing" xmlns:w10="urn:schemas-microsoft-com:office:word" xmlns:w="http://schemas.openxmlformats.org/wordprocessingml/2006/main" xmlns:w14="http://schemas.microsoft.com/office/word/2010/wordml" xmlns:w15="http://schemas.microsoft.com/office/word/2012/wordml" xmlns:w16cex="http://schemas.microsoft.com/office/word/2018/wordml/cex" xmlns:w16cid="http://schemas.microsoft.com/office/word/2016/wordml/cid" xmlns:w16="http://schemas.microsoft.com/office/word/2018/wordml" xmlns:w16du="http://schemas.microsoft.com/office/word/2023/wordml/word16du" xmlns:w16sdtdh="http://schemas.microsoft.com/office/word/2020/wordml/sdtdatahash" xmlns:w16sdtfl="http://schemas.microsoft.com/office/word/2024/wordml/sdtformatlock" xmlns:w16se="http://schemas.microsoft.com/office/word/2015/wordml/symex" xmlns:wpg="http://schemas.microsoft.com/office/word/2010/wordprocessingGroup" xmlns:wpi="http://schemas.microsoft.com/office/word/2010/wordprocessingInk" xmlns:wne="http://schemas.microsoft.com/office/word/2006/wordml" xmlns:wps="http://schemas.microsoft.com/office/word/2010/wordprocessingShape" mc:Ignorable="w14 w15 w16se w16cid w16 w16cex w16sdtdh w16sdtfl w16du wp14">
+  <w:p>
+    <w:pPr>
+      <w:pStyle w:val="Kopfzeile"/>
+    </w:pPr>
+    <w:r>
+      <w:rPr>
+        <w:noProof/>
+      </w:rPr>
+      <w:drawing>
+        <wp:anchor distT="0" distB="0" distL="114300" distR="114300" simplePos="0" relativeHeight="251660288" behindDoc="1" locked="0" layoutInCell="1" allowOverlap="1" wp14:anchorId="6908AF13" wp14:editId="2ECC1C0D">
+          <wp:simplePos x="0" y="0"/>
+          <wp:positionH relativeFrom="margin">
+            <wp:align>right</wp:align>
+          </wp:positionH>
+          <wp:positionV relativeFrom="paragraph">
+            <wp:posOffset>-906780</wp:posOffset>
+          </wp:positionV>
+          <wp:extent cx="1341120" cy="749935"/>
+          <wp:effectExtent l="0" t="0" r="0" b="0"/>
+          <wp:wrapNone/>
+          <wp:docPr id="282182487" name="Grafik 1"/>
+          <wp:cNvGraphicFramePr>
+            <a:graphicFrameLocks xmlns:a="http://schemas.openxmlformats.org/drawingml/2006/main" noChangeAspect="1"/>
+          </wp:cNvGraphicFramePr>
+          <a:graphic xmlns:a="http://schemas.openxmlformats.org/drawingml/2006/main">
+            <a:graphicData uri="http://schemas.openxmlformats.org/drawingml/2006/picture">
+              <pic:pic xmlns:pic="http://schemas.openxmlformats.org/drawingml/2006/picture">
+                <pic:nvPicPr>
+                  <pic:cNvPr id="0" name="Picture 1"/>
+                  <pic:cNvPicPr>
+                    <a:picLocks noChangeAspect="1" noChangeArrowheads="1"/>
+                  </pic:cNvPicPr>
+                </pic:nvPicPr>
+                <pic:blipFill>
+                  <a:blip r:embed="rId1">
+                    <a:extLst>
+                      <a:ext uri="{28A0092B-C50C-407E-A947-70E740481C1C}">
+                        <a14:useLocalDpi xmlns:a14="http://schemas.microsoft.com/office/drawing/2010/main" val="0"/>
+                      </a:ext>
+                    </a:extLst>
+                  </a:blip>
+                  <a:srcRect/>
+                  <a:stretch>
+                    <a:fillRect/>
+                  </a:stretch>
+                </pic:blipFill>
+                <pic:spPr bwMode="auto">
+                  <a:xfrm>
+                    <a:off x="0" y="0"/>
+                    <a:ext cx="1341120" cy="749935"/>
+                  </a:xfrm>
+                  <a:prstGeom prst="rect">
+                    <a:avLst/>
+                  </a:prstGeom>
+                  <a:noFill/>
+                </pic:spPr>
+              </pic:pic>
+            </a:graphicData>
+          </a:graphic>
+          <wp14:sizeRelH relativeFrom="page">
+            <wp14:pctWidth>0</wp14:pctWidth>
+          </wp14:sizeRelH>
+          <wp14:sizeRelV relativeFrom="page">
+            <wp14:pctHeight>0</wp14:pctHeight>
+          </wp14:sizeRelV>
+        </wp:anchor>
+      </w:drawing>
+    </w:r>
+  </w:p>
+</w:hdr>
 </file>
 
 <file path=word/numbering.xml><?xml version="1.0" encoding="utf-8"?>
@@ -1248,13 +2022,10 @@
     <w:link w:val="berschrift1Zchn"/>
     <w:uiPriority w:val="9"/>
     <w:qFormat/>
-    <w:rsid w:val="003B5297"/>
+    <w:rsid w:val="00030081"/>
     <w:pPr>
       <w:keepNext/>
       <w:keepLines/>
-      <w:pBdr>
-        <w:bottom w:color="156082" w:space="1" w:sz="4" w:themeColor="accent1" w:val="single"/>
-      </w:pBdr>
       <w:spacing w:after="240" w:before="480" w:line="240" w:lineRule="auto"/>
       <w:outlineLvl w:val="0"/>
     </w:pPr>
@@ -1479,7 +2250,7 @@
     <w:basedOn w:val="Absatz-Standardschriftart"/>
     <w:link w:val="berschrift1"/>
     <w:uiPriority w:val="9"/>
-    <w:rsid w:val="003B5297"/>
+    <w:rsid w:val="00030081"/>
     <w:rPr>
       <w:rFonts w:asciiTheme="majorHAnsi" w:cstheme="majorBidi" w:eastAsiaTheme="majorEastAsia" w:hAnsiTheme="majorHAnsi"/>
       <w:b/>

</xml_diff>